<commit_message>
Documentos templates: preserve original run formatting
The previous preprocessor cleared every run in each variable paragraph and
dropped the placeholder into the first run, which meant {NOME}, {CPF},
{DATA} and {FUNCAO} all inherited the small label format instead of the
large value format that the original Word doc used.

Now we edit only the specific <w:r> runs that originally held each value
(or, for values split across runs like the date "1/8/0/5/2026", we keep
the first piece and blank the rest). Each placeholder ends up in the same
run that used to hold the variable text, so it carries the right size,
weight, underline and font automatically.

Co-Authored-By: Claude Opus 4.7 <noreply@anthropic.com>
</commit_message>
<xml_diff>
--- a/src/lib/templates/aviso-medico-template.docx
+++ b/src/lib/templates/aviso-medico-template.docx
@@ -616,7 +616,7 @@
                                   <w:rFonts w:ascii="Calibri"/>
                                   <w:sz w:val="14"/>
                                 </w:rPr>
-                                <w:t xml:space="preserve">Encaminho Sr. (a)    {NOME}                                     CPF  {CPF};</w:t>
+                                <w:t>Encaminho</w:t>
                               </w:r>
                               <w:r>
                                 <w:rPr>
@@ -624,14 +624,14 @@
                                   <w:spacing w:val="-4"/>
                                   <w:sz w:val="14"/>
                                 </w:rPr>
-                                <w:t xml:space="preserve"/>
+                                <w:t xml:space="preserve"> </w:t>
                               </w:r>
                               <w:r>
                                 <w:rPr>
                                   <w:rFonts w:ascii="Calibri"/>
                                   <w:sz w:val="14"/>
                                 </w:rPr>
-                                <w:t/>
+                                <w:t>Sr.</w:t>
                               </w:r>
                               <w:r>
                                 <w:rPr>
@@ -639,7 +639,7 @@
                                   <w:spacing w:val="-1"/>
                                   <w:sz w:val="14"/>
                                 </w:rPr>
-                                <w:t xml:space="preserve"/>
+                                <w:t xml:space="preserve"> </w:t>
                               </w:r>
                               <w:r>
                                 <w:rPr>
@@ -648,7 +648,7 @@
                                   <w:sz w:val="14"/>
                                   <w:lang w:val="pt-BR"/>
                                 </w:rPr>
-                                <w:t/>
+                                <w:t>(a)</w:t>
                               </w:r>
                               <w:r>
                                 <w:rPr>
@@ -657,7 +657,7 @@
                                   <w:sz w:val="14"/>
                                   <w:lang w:val="pt-BR"/>
                                 </w:rPr>
-                                <w:t xml:space="preserve"/>
+                                <w:t xml:space="preserve"> </w:t>
                               </w:r>
                               <w:r>
                                 <w:rPr>
@@ -667,7 +667,7 @@
                                   <w:szCs w:val="24"/>
                                   <w:lang w:val="pt-BR"/>
                                 </w:rPr>
-                                <w:t xml:space="preserve"/>
+                                <w:t xml:space="preserve"> </w:t>
                               </w:r>
                               <w:r>
                                 <w:rPr>
@@ -677,7 +677,7 @@
                                   <w:szCs w:val="24"/>
                                   <w:lang w:val="pt-BR"/>
                                 </w:rPr>
-                                <w:t xml:space="preserve"/>
+                                <w:t xml:space="preserve"> </w:t>
                               </w:r>
                               <w:r>
                                 <w:rPr>
@@ -687,7 +687,7 @@
                                   <w:szCs w:val="24"/>
                                   <w:lang w:val="pt-BR"/>
                                 </w:rPr>
-                                <w:t xml:space="preserve"/>
+                                <w:t xml:space="preserve"> </w:t>
                               </w:r>
                               <w:r>
                                 <w:rPr>
@@ -697,7 +697,7 @@
                                   <w:szCs w:val="24"/>
                                   <w:lang w:val="pt-BR"/>
                                 </w:rPr>
-                                <w:t/>
+                                <w:t xml:space="preserve">{NOME}</w:t>
                               </w:r>
                               <w:r>
                                 <w:rPr>
@@ -707,7 +707,7 @@
                                   <w:szCs w:val="24"/>
                                   <w:lang w:val="pt-BR"/>
                                 </w:rPr>
-                                <w:t xml:space="preserve"/>
+                                <w:t xml:space="preserve"> </w:t>
                               </w:r>
                               <w:r>
                                 <w:rPr>
@@ -717,7 +717,7 @@
                                   <w:szCs w:val="24"/>
                                   <w:lang w:val="pt-BR"/>
                                 </w:rPr>
-                                <w:t xml:space="preserve"/>
+                                <w:t xml:space="preserve"> </w:t>
                               </w:r>
                               <w:r>
                                 <w:rPr>
@@ -727,7 +727,7 @@
                                   <w:szCs w:val="24"/>
                                   <w:lang w:val="pt-BR"/>
                                 </w:rPr>
-                                <w:t xml:space="preserve"/>
+                                <w:t xml:space="preserve">                                   </w:t>
                               </w:r>
                               <w:r>
                                 <w:rPr>
@@ -737,7 +737,7 @@
                                   <w:szCs w:val="20"/>
                                   <w:lang w:val="pt-BR" w:eastAsia="pt-BR"/>
                                 </w:rPr>
-                                <w:t/>
+                                <w:t>CPF</w:t>
                               </w:r>
                               <w:r>
                                 <w:rPr>
@@ -747,7 +747,7 @@
                                   <w:szCs w:val="20"/>
                                   <w:lang w:val="pt-BR" w:eastAsia="pt-BR"/>
                                 </w:rPr>
-                                <w:t xml:space="preserve"/>
+                                <w:t xml:space="preserve"> </w:t>
                               </w:r>
                               <w:r>
                                 <w:rPr>
@@ -757,7 +757,7 @@
                                   <w:szCs w:val="20"/>
                                   <w:lang w:val="pt-BR" w:eastAsia="pt-BR"/>
                                 </w:rPr>
-                                <w:t xml:space="preserve"/>
+                                <w:t xml:space="preserve"> </w:t>
                               </w:r>
                               <w:r>
                                 <w:rPr>
@@ -767,7 +767,7 @@
                                   <w:szCs w:val="20"/>
                                   <w:lang w:val="pt-BR" w:eastAsia="pt-BR"/>
                                 </w:rPr>
-                                <w:t/>
+                                <w:t xml:space="preserve">{CPF};</w:t>
                               </w:r>
                             </w:p>
                           </w:txbxContent>
@@ -826,34 +826,34 @@
                                 <w:rPr>
                                   <w:sz w:val="14"/>
                                 </w:rPr>
-                                <w:t xml:space="preserve">Nº Matricula (Esocial)  {MATRICULA}</w:t>
+                                <w:t>N°</w:t>
                               </w:r>
                               <w:r>
                                 <w:rPr>
                                   <w:spacing w:val="-6"/>
                                   <w:sz w:val="14"/>
                                 </w:rPr>
-                                <w:t xml:space="preserve"/>
+                                <w:t xml:space="preserve"> </w:t>
                               </w:r>
                               <w:r>
                                 <w:rPr>
                                   <w:sz w:val="14"/>
                                 </w:rPr>
-                                <w:t/>
+                                <w:t>Matricula</w:t>
                               </w:r>
                               <w:r>
                                 <w:rPr>
                                   <w:spacing w:val="-7"/>
                                   <w:sz w:val="14"/>
                                 </w:rPr>
-                                <w:t xml:space="preserve"/>
+                                <w:t xml:space="preserve"> </w:t>
                               </w:r>
                               <w:r>
                                 <w:rPr>
                                   <w:spacing w:val="-2"/>
                                   <w:sz w:val="14"/>
                                 </w:rPr>
-                                <w:t/>
+                                <w:t xml:space="preserve">(Esocial)  {MATRICULA}</w:t>
                               </w:r>
                             </w:p>
                           </w:txbxContent>
@@ -971,7 +971,7 @@
                                   <w:bCs/>
                                   <w:spacing w:val="-2"/>
                                 </w:rPr>
-                                <w:t xml:space="preserve">Função: {FUNCAO}</w:t>
+                                <w:t>Função:</w:t>
                               </w:r>
                               <w:r>
                                 <w:rPr>
@@ -980,7 +980,7 @@
                                   <w:bCs/>
                                   <w:spacing w:val="-23"/>
                                 </w:rPr>
-                                <w:t xml:space="preserve"/>
+                                <w:t xml:space="preserve"> </w:t>
                               </w:r>
                               <w:r>
                                 <w:rPr>
@@ -989,7 +989,7 @@
                                   <w:bCs/>
                                   <w:spacing w:val="-2"/>
                                 </w:rPr>
-                                <w:t/>
+                                <w:t xml:space="preserve">{FUNCAO}</w:t>
                               </w:r>
                               <w:r>
                                 <w:rPr>
@@ -1007,7 +1007,7 @@
                                   <w:bCs/>
                                   <w:spacing w:val="-2"/>
                                 </w:rPr>
-                                <w:t/>
+                                <w:t xml:space="preserve"/>
                               </w:r>
                             </w:p>
                             <w:p>
@@ -1022,40 +1022,40 @@
                                 <w:rPr>
                                   <w:rFonts w:ascii="Calibri"/>
                                 </w:rPr>
-                                <w:t xml:space="preserve">Data do Comparecimento: {DATA}</w:t>
+                                <w:t>Data</w:t>
                               </w:r>
                               <w:r>
                                 <w:rPr>
                                   <w:rFonts w:ascii="Calibri"/>
                                   <w:spacing w:val="-13"/>
                                 </w:rPr>
-                                <w:t xml:space="preserve"/>
+                                <w:t xml:space="preserve"> </w:t>
                               </w:r>
                               <w:r>
                                 <w:rPr>
                                   <w:rFonts w:ascii="Calibri"/>
                                 </w:rPr>
-                                <w:t/>
+                                <w:t>do</w:t>
                               </w:r>
                               <w:r>
                                 <w:rPr>
                                   <w:rFonts w:ascii="Calibri"/>
                                   <w:spacing w:val="-12"/>
                                 </w:rPr>
-                                <w:t xml:space="preserve"/>
+                                <w:t xml:space="preserve"> </w:t>
                               </w:r>
                               <w:r>
                                 <w:rPr>
                                   <w:rFonts w:ascii="Calibri"/>
                                 </w:rPr>
-                                <w:t/>
+                                <w:t>Comparecimento:</w:t>
                               </w:r>
                               <w:r>
                                 <w:rPr>
                                   <w:rFonts w:ascii="Calibri"/>
                                   <w:spacing w:val="21"/>
                                 </w:rPr>
-                                <w:t xml:space="preserve"/>
+                                <w:t xml:space="preserve"> </w:t>
                               </w:r>
                               <w:r>
                                 <w:rPr>
@@ -1064,7 +1064,7 @@
                                   <w:spacing w:val="-2"/>
                                   <w:u w:val="single"/>
                                 </w:rPr>
-                                <w:t/>
+                                <w:t xml:space="preserve">{DATA}</w:t>
                               </w:r>
                               <w:r>
                                 <w:rPr>
@@ -1073,7 +1073,7 @@
                                   <w:spacing w:val="-2"/>
                                   <w:u w:val="single"/>
                                 </w:rPr>
-                                <w:t/>
+                                <w:t xml:space="preserve"/>
                               </w:r>
                               <w:r>
                                 <w:rPr>
@@ -1082,7 +1082,7 @@
                                   <w:spacing w:val="-2"/>
                                   <w:u w:val="single"/>
                                 </w:rPr>
-                                <w:t/>
+                                <w:t xml:space="preserve"/>
                               </w:r>
                               <w:r>
                                 <w:rPr>
@@ -1091,7 +1091,7 @@
                                   <w:spacing w:val="-2"/>
                                   <w:u w:val="single"/>
                                 </w:rPr>
-                                <w:t/>
+                                <w:t xml:space="preserve"/>
                               </w:r>
                               <w:r>
                                 <w:rPr>
@@ -1100,7 +1100,7 @@
                                   <w:spacing w:val="-2"/>
                                   <w:u w:val="single"/>
                                 </w:rPr>
-                                <w:t/>
+                                <w:t xml:space="preserve"/>
                               </w:r>
                             </w:p>
                             <w:p>
@@ -1333,7 +1333,7 @@
                                   <w:b/>
                                   <w:sz w:val="20"/>
                                 </w:rPr>
-                                <w:t xml:space="preserve">( X ) {TIPO_EXAME}</w:t>
+                                <w:t>(</w:t>
                               </w:r>
                               <w:r>
                                 <w:rPr>
@@ -1342,7 +1342,7 @@
                                   <w:spacing w:val="-3"/>
                                   <w:sz w:val="20"/>
                                 </w:rPr>
-                                <w:t xml:space="preserve"/>
+                                <w:t xml:space="preserve"> </w:t>
                               </w:r>
                               <w:r>
                                 <w:rPr>
@@ -1350,7 +1350,7 @@
                                   <w:b/>
                                   <w:sz w:val="20"/>
                                 </w:rPr>
-                                <w:t/>
+                                <w:t>X</w:t>
                               </w:r>
                               <w:r>
                                 <w:rPr>
@@ -1359,7 +1359,7 @@
                                   <w:spacing w:val="-5"/>
                                   <w:sz w:val="20"/>
                                 </w:rPr>
-                                <w:t xml:space="preserve"/>
+                                <w:t xml:space="preserve"> </w:t>
                               </w:r>
                               <w:r>
                                 <w:rPr>
@@ -1367,7 +1367,7 @@
                                   <w:b/>
                                   <w:sz w:val="20"/>
                                 </w:rPr>
-                                <w:t/>
+                                <w:t>)</w:t>
                               </w:r>
                               <w:r>
                                 <w:rPr>
@@ -1375,7 +1375,7 @@
                                   <w:b/>
                                   <w:sz w:val="20"/>
                                 </w:rPr>
-                                <w:t xml:space="preserve"/>
+                                <w:t xml:space="preserve"> </w:t>
                               </w:r>
                               <w:r>
                                 <w:rPr>
@@ -1384,7 +1384,7 @@
                                   <w:spacing w:val="-1"/>
                                   <w:sz w:val="20"/>
                                 </w:rPr>
-                                <w:t/>
+                                <w:t xml:space="preserve">{TIPO_EXAME}</w:t>
                               </w:r>
                               <w:r>
                                 <w:rPr>
@@ -1393,7 +1393,7 @@
                                   <w:spacing w:val="-1"/>
                                   <w:sz w:val="20"/>
                                 </w:rPr>
-                                <w:t/>
+                                <w:t xml:space="preserve"/>
                               </w:r>
                             </w:p>
                             <w:p>
@@ -2129,7 +2129,7 @@
                             <w:rFonts w:ascii="Calibri"/>
                             <w:sz w:val="14"/>
                           </w:rPr>
-                          <w:t xml:space="preserve">Encaminho Sr. (a)    {NOME}                                     CPF  {CPF};</w:t>
+                          <w:t>Encaminho</w:t>
                         </w:r>
                         <w:r>
                           <w:rPr>
@@ -2137,14 +2137,14 @@
                             <w:spacing w:val="-4"/>
                             <w:sz w:val="14"/>
                           </w:rPr>
-                          <w:t xml:space="preserve"/>
+                          <w:t xml:space="preserve"> </w:t>
                         </w:r>
                         <w:r>
                           <w:rPr>
                             <w:rFonts w:ascii="Calibri"/>
                             <w:sz w:val="14"/>
                           </w:rPr>
-                          <w:t/>
+                          <w:t>Sr.</w:t>
                         </w:r>
                         <w:r>
                           <w:rPr>
@@ -2152,7 +2152,7 @@
                             <w:spacing w:val="-1"/>
                             <w:sz w:val="14"/>
                           </w:rPr>
-                          <w:t xml:space="preserve"/>
+                          <w:t xml:space="preserve"> </w:t>
                         </w:r>
                         <w:r>
                           <w:rPr>
@@ -2161,7 +2161,7 @@
                             <w:sz w:val="14"/>
                             <w:lang w:val="pt-BR"/>
                           </w:rPr>
-                          <w:t/>
+                          <w:t>(a)</w:t>
                         </w:r>
                         <w:r>
                           <w:rPr>
@@ -2170,7 +2170,7 @@
                             <w:sz w:val="14"/>
                             <w:lang w:val="pt-BR"/>
                           </w:rPr>
-                          <w:t xml:space="preserve"/>
+                          <w:t xml:space="preserve"> </w:t>
                         </w:r>
                         <w:r>
                           <w:rPr>
@@ -2180,7 +2180,7 @@
                             <w:szCs w:val="24"/>
                             <w:lang w:val="pt-BR"/>
                           </w:rPr>
-                          <w:t xml:space="preserve"/>
+                          <w:t xml:space="preserve"> </w:t>
                         </w:r>
                         <w:r>
                           <w:rPr>
@@ -2190,7 +2190,7 @@
                             <w:szCs w:val="24"/>
                             <w:lang w:val="pt-BR"/>
                           </w:rPr>
-                          <w:t xml:space="preserve"/>
+                          <w:t xml:space="preserve"> </w:t>
                         </w:r>
                         <w:r>
                           <w:rPr>
@@ -2200,7 +2200,7 @@
                             <w:szCs w:val="24"/>
                             <w:lang w:val="pt-BR"/>
                           </w:rPr>
-                          <w:t xml:space="preserve"/>
+                          <w:t xml:space="preserve"> </w:t>
                         </w:r>
                         <w:r>
                           <w:rPr>
@@ -2210,7 +2210,7 @@
                             <w:szCs w:val="24"/>
                             <w:lang w:val="pt-BR"/>
                           </w:rPr>
-                          <w:t/>
+                          <w:t xml:space="preserve">{NOME}</w:t>
                         </w:r>
                         <w:r>
                           <w:rPr>
@@ -2220,7 +2220,7 @@
                             <w:szCs w:val="24"/>
                             <w:lang w:val="pt-BR"/>
                           </w:rPr>
-                          <w:t xml:space="preserve"/>
+                          <w:t xml:space="preserve"> </w:t>
                         </w:r>
                         <w:r>
                           <w:rPr>
@@ -2230,7 +2230,7 @@
                             <w:szCs w:val="24"/>
                             <w:lang w:val="pt-BR"/>
                           </w:rPr>
-                          <w:t xml:space="preserve"/>
+                          <w:t xml:space="preserve"> </w:t>
                         </w:r>
                         <w:r>
                           <w:rPr>
@@ -2240,7 +2240,7 @@
                             <w:szCs w:val="24"/>
                             <w:lang w:val="pt-BR"/>
                           </w:rPr>
-                          <w:t xml:space="preserve"/>
+                          <w:t xml:space="preserve">                                   </w:t>
                         </w:r>
                         <w:r>
                           <w:rPr>
@@ -2250,7 +2250,7 @@
                             <w:szCs w:val="20"/>
                             <w:lang w:val="pt-BR" w:eastAsia="pt-BR"/>
                           </w:rPr>
-                          <w:t/>
+                          <w:t>CPF</w:t>
                         </w:r>
                         <w:r>
                           <w:rPr>
@@ -2260,7 +2260,7 @@
                             <w:szCs w:val="20"/>
                             <w:lang w:val="pt-BR" w:eastAsia="pt-BR"/>
                           </w:rPr>
-                          <w:t xml:space="preserve"/>
+                          <w:t xml:space="preserve"> </w:t>
                         </w:r>
                         <w:r>
                           <w:rPr>
@@ -2270,7 +2270,7 @@
                             <w:szCs w:val="20"/>
                             <w:lang w:val="pt-BR" w:eastAsia="pt-BR"/>
                           </w:rPr>
-                          <w:t xml:space="preserve"/>
+                          <w:t xml:space="preserve"> </w:t>
                         </w:r>
                         <w:r>
                           <w:rPr>
@@ -2280,7 +2280,7 @@
                             <w:szCs w:val="20"/>
                             <w:lang w:val="pt-BR" w:eastAsia="pt-BR"/>
                           </w:rPr>
-                          <w:t/>
+                          <w:t xml:space="preserve">{CPF};</w:t>
                         </w:r>
                       </w:p>
                     </w:txbxContent>
@@ -2300,34 +2300,34 @@
                           <w:rPr>
                             <w:sz w:val="14"/>
                           </w:rPr>
-                          <w:t xml:space="preserve">Nº Matricula (Esocial)  {MATRICULA}</w:t>
+                          <w:t>N°</w:t>
                         </w:r>
                         <w:r>
                           <w:rPr>
                             <w:spacing w:val="-6"/>
                             <w:sz w:val="14"/>
                           </w:rPr>
-                          <w:t xml:space="preserve"/>
+                          <w:t xml:space="preserve"> </w:t>
                         </w:r>
                         <w:r>
                           <w:rPr>
                             <w:sz w:val="14"/>
                           </w:rPr>
-                          <w:t/>
+                          <w:t>Matricula</w:t>
                         </w:r>
                         <w:r>
                           <w:rPr>
                             <w:spacing w:val="-7"/>
                             <w:sz w:val="14"/>
                           </w:rPr>
-                          <w:t xml:space="preserve"/>
+                          <w:t xml:space="preserve"> </w:t>
                         </w:r>
                         <w:r>
                           <w:rPr>
                             <w:spacing w:val="-2"/>
                             <w:sz w:val="14"/>
                           </w:rPr>
-                          <w:t/>
+                          <w:t xml:space="preserve">(Esocial)  {MATRICULA}</w:t>
                         </w:r>
                       </w:p>
                     </w:txbxContent>
@@ -2367,7 +2367,7 @@
                             <w:bCs/>
                             <w:spacing w:val="-2"/>
                           </w:rPr>
-                          <w:t xml:space="preserve">Função: {FUNCAO}</w:t>
+                          <w:t>Função:</w:t>
                         </w:r>
                         <w:r>
                           <w:rPr>
@@ -2376,7 +2376,7 @@
                             <w:bCs/>
                             <w:spacing w:val="-23"/>
                           </w:rPr>
-                          <w:t xml:space="preserve"/>
+                          <w:t xml:space="preserve"> </w:t>
                         </w:r>
                         <w:r>
                           <w:rPr>
@@ -2385,7 +2385,7 @@
                             <w:bCs/>
                             <w:spacing w:val="-2"/>
                           </w:rPr>
-                          <w:t/>
+                          <w:t xml:space="preserve">{FUNCAO}</w:t>
                         </w:r>
                         <w:r>
                           <w:rPr>
@@ -2403,7 +2403,7 @@
                             <w:bCs/>
                             <w:spacing w:val="-2"/>
                           </w:rPr>
-                          <w:t/>
+                          <w:t xml:space="preserve"/>
                         </w:r>
                       </w:p>
                       <w:p>
@@ -2418,40 +2418,40 @@
                           <w:rPr>
                             <w:rFonts w:ascii="Calibri"/>
                           </w:rPr>
-                          <w:t xml:space="preserve">Data do Comparecimento: {DATA}</w:t>
+                          <w:t>Data</w:t>
                         </w:r>
                         <w:r>
                           <w:rPr>
                             <w:rFonts w:ascii="Calibri"/>
                             <w:spacing w:val="-13"/>
                           </w:rPr>
-                          <w:t xml:space="preserve"/>
+                          <w:t xml:space="preserve"> </w:t>
                         </w:r>
                         <w:r>
                           <w:rPr>
                             <w:rFonts w:ascii="Calibri"/>
                           </w:rPr>
-                          <w:t/>
+                          <w:t>do</w:t>
                         </w:r>
                         <w:r>
                           <w:rPr>
                             <w:rFonts w:ascii="Calibri"/>
                             <w:spacing w:val="-12"/>
                           </w:rPr>
-                          <w:t xml:space="preserve"/>
+                          <w:t xml:space="preserve"> </w:t>
                         </w:r>
                         <w:r>
                           <w:rPr>
                             <w:rFonts w:ascii="Calibri"/>
                           </w:rPr>
-                          <w:t/>
+                          <w:t>Comparecimento:</w:t>
                         </w:r>
                         <w:r>
                           <w:rPr>
                             <w:rFonts w:ascii="Calibri"/>
                             <w:spacing w:val="21"/>
                           </w:rPr>
-                          <w:t xml:space="preserve"/>
+                          <w:t xml:space="preserve"> </w:t>
                         </w:r>
                         <w:r>
                           <w:rPr>
@@ -2460,7 +2460,7 @@
                             <w:spacing w:val="-2"/>
                             <w:u w:val="single"/>
                           </w:rPr>
-                          <w:t/>
+                          <w:t xml:space="preserve">{DATA}</w:t>
                         </w:r>
                         <w:r>
                           <w:rPr>
@@ -2469,7 +2469,7 @@
                             <w:spacing w:val="-2"/>
                             <w:u w:val="single"/>
                           </w:rPr>
-                          <w:t/>
+                          <w:t xml:space="preserve"/>
                         </w:r>
                         <w:r>
                           <w:rPr>
@@ -2478,7 +2478,7 @@
                             <w:spacing w:val="-2"/>
                             <w:u w:val="single"/>
                           </w:rPr>
-                          <w:t/>
+                          <w:t xml:space="preserve"/>
                         </w:r>
                         <w:r>
                           <w:rPr>
@@ -2487,7 +2487,7 @@
                             <w:spacing w:val="-2"/>
                             <w:u w:val="single"/>
                           </w:rPr>
-                          <w:t/>
+                          <w:t xml:space="preserve"/>
                         </w:r>
                         <w:r>
                           <w:rPr>
@@ -2496,7 +2496,7 @@
                             <w:spacing w:val="-2"/>
                             <w:u w:val="single"/>
                           </w:rPr>
-                          <w:t/>
+                          <w:t xml:space="preserve"/>
                         </w:r>
                       </w:p>
                       <w:p>
@@ -2612,7 +2612,7 @@
                             <w:b/>
                             <w:sz w:val="20"/>
                           </w:rPr>
-                          <w:t xml:space="preserve">( X ) {TIPO_EXAME}</w:t>
+                          <w:t>(</w:t>
                         </w:r>
                         <w:r>
                           <w:rPr>
@@ -2621,7 +2621,7 @@
                             <w:spacing w:val="-3"/>
                             <w:sz w:val="20"/>
                           </w:rPr>
-                          <w:t xml:space="preserve"/>
+                          <w:t xml:space="preserve"> </w:t>
                         </w:r>
                         <w:r>
                           <w:rPr>
@@ -2629,7 +2629,7 @@
                             <w:b/>
                             <w:sz w:val="20"/>
                           </w:rPr>
-                          <w:t/>
+                          <w:t>X</w:t>
                         </w:r>
                         <w:r>
                           <w:rPr>
@@ -2638,7 +2638,7 @@
                             <w:spacing w:val="-5"/>
                             <w:sz w:val="20"/>
                           </w:rPr>
-                          <w:t xml:space="preserve"/>
+                          <w:t xml:space="preserve"> </w:t>
                         </w:r>
                         <w:r>
                           <w:rPr>
@@ -2646,7 +2646,7 @@
                             <w:b/>
                             <w:sz w:val="20"/>
                           </w:rPr>
-                          <w:t/>
+                          <w:t>)</w:t>
                         </w:r>
                         <w:r>
                           <w:rPr>
@@ -2654,7 +2654,7 @@
                             <w:b/>
                             <w:sz w:val="20"/>
                           </w:rPr>
-                          <w:t xml:space="preserve"/>
+                          <w:t xml:space="preserve"> </w:t>
                         </w:r>
                         <w:r>
                           <w:rPr>
@@ -2663,7 +2663,7 @@
                             <w:spacing w:val="-1"/>
                             <w:sz w:val="20"/>
                           </w:rPr>
-                          <w:t/>
+                          <w:t xml:space="preserve">{TIPO_EXAME}</w:t>
                         </w:r>
                         <w:r>
                           <w:rPr>
@@ -2672,7 +2672,7 @@
                             <w:spacing w:val="-1"/>
                             <w:sz w:val="20"/>
                           </w:rPr>
-                          <w:t/>
+                          <w:t xml:space="preserve"/>
                         </w:r>
                       </w:p>
                       <w:p>

</xml_diff>

<commit_message>
RH/Aviso Medico: reduz fonte do encaminhamento para nao cortar
Nome do colaborador e endereco do rodape estavam grandes demais
(12pt e 14pt), estourando a caixa. Reduzidos para 10pt, alinhando
com o texto do CPF. Tabela de horarios (pagina 2) mantida intacta.

Co-Authored-By: Claude Opus 4.8 <noreply@anthropic.com>
</commit_message>
<xml_diff>
--- a/src/lib/templates/aviso-medico-template.docx
+++ b/src/lib/templates/aviso-medico-template.docx
@@ -426,7 +426,7 @@
                                 <w:spacing w:line="268" w:lineRule="exact"/>
                                 <w:ind w:left="31"/>
                                 <w:rPr>
-                                  <w:sz w:val="24"/>
+                                  <w:sz w:val="20"/>
                                 </w:rPr>
                               </w:pPr>
                               <w:r>
@@ -446,7 +446,7 @@
                                 <w:rPr>
                                   <w:rFonts w:ascii="Arial" w:hAnsi="Arial"/>
                                   <w:b/>
-                                  <w:sz w:val="24"/>
+                                  <w:sz w:val="20"/>
                                   <w:u w:val="single"/>
                                 </w:rPr>
                                 <w:t xml:space="preserve"> </w:t>
@@ -455,7 +455,7 @@
                                 <w:rPr>
                                   <w:rFonts w:ascii="Arial" w:hAnsi="Arial"/>
                                   <w:b/>
-                                  <w:sz w:val="24"/>
+                                  <w:sz w:val="20"/>
                                 </w:rPr>
                                 <w:t>CARGO SHIPS CLEA</w:t>
                               </w:r>
@@ -463,7 +463,7 @@
                                 <w:rPr>
                                   <w:rFonts w:ascii="Arial" w:hAnsi="Arial"/>
                                   <w:b/>
-                                  <w:sz w:val="24"/>
+                                  <w:sz w:val="20"/>
                                 </w:rPr>
                                 <w:t>NING LTDA</w:t>
                               </w:r>
@@ -471,7 +471,7 @@
                                 <w:rPr>
                                   <w:rFonts w:ascii="Arial" w:hAnsi="Arial"/>
                                   <w:b/>
-                                  <w:sz w:val="24"/>
+                                  <w:sz w:val="20"/>
                                 </w:rPr>
                                 <w:t xml:space="preserve">  </w:t>
                               </w:r>
@@ -479,7 +479,7 @@
                                 <w:rPr>
                                   <w:rFonts w:ascii="Arial" w:hAnsi="Arial"/>
                                   <w:b/>
-                                  <w:sz w:val="24"/>
+                                  <w:sz w:val="20"/>
                                 </w:rPr>
                                 <w:t xml:space="preserve">     </w:t>
                               </w:r>
@@ -487,7 +487,7 @@
                                 <w:rPr>
                                   <w:rFonts w:ascii="Arial" w:hAnsi="Arial"/>
                                   <w:b/>
-                                  <w:sz w:val="24"/>
+                                  <w:sz w:val="20"/>
                                 </w:rPr>
                                 <w:t xml:space="preserve">                        </w:t>
                               </w:r>
@@ -495,47 +495,47 @@
                                 <w:rPr>
                                   <w:rFonts w:ascii="Arial" w:hAnsi="Arial"/>
                                   <w:b/>
-                                  <w:sz w:val="24"/>
+                                  <w:sz w:val="20"/>
                                 </w:rPr>
                                 <w:t xml:space="preserve">   </w:t>
                               </w:r>
                               <w:r>
                                 <w:rPr>
-                                  <w:sz w:val="24"/>
+                                  <w:sz w:val="20"/>
                                 </w:rPr>
                                 <w:t>UNIDADE</w:t>
                               </w:r>
                               <w:r>
                                 <w:rPr>
                                   <w:spacing w:val="-8"/>
-                                  <w:sz w:val="24"/>
+                                  <w:sz w:val="20"/>
                                 </w:rPr>
                                 <w:t xml:space="preserve"> </w:t>
                               </w:r>
                               <w:r>
                                 <w:rPr>
-                                  <w:sz w:val="24"/>
+                                  <w:sz w:val="20"/>
                                 </w:rPr>
                                 <w:t>/</w:t>
                               </w:r>
                               <w:r>
                                 <w:rPr>
                                   <w:spacing w:val="-1"/>
-                                  <w:sz w:val="24"/>
+                                  <w:sz w:val="20"/>
                                 </w:rPr>
                                 <w:t xml:space="preserve"> </w:t>
                               </w:r>
                               <w:r>
                                 <w:rPr>
                                   <w:spacing w:val="-2"/>
-                                  <w:sz w:val="24"/>
+                                  <w:sz w:val="20"/>
                                 </w:rPr>
                                 <w:t>ÁREA:</w:t>
                               </w:r>
                               <w:r>
                                 <w:rPr>
                                   <w:spacing w:val="-2"/>
-                                  <w:sz w:val="24"/>
+                                  <w:sz w:val="20"/>
                                   <w:u w:val="single"/>
                                 </w:rPr>
                                 <w:t>SANTOS</w:t>
@@ -543,7 +543,7 @@
                               <w:r>
                                 <w:rPr>
                                   <w:spacing w:val="80"/>
-                                  <w:sz w:val="24"/>
+                                  <w:sz w:val="20"/>
                                   <w:u w:val="single"/>
                                 </w:rPr>
                                 <w:t xml:space="preserve"> </w:t>
@@ -553,36 +553,36 @@
                               <w:pPr>
                                 <w:spacing w:before="40"/>
                                 <w:rPr>
-                                  <w:sz w:val="24"/>
+                                  <w:sz w:val="20"/>
                                 </w:rPr>
                               </w:pPr>
                               <w:r>
                                 <w:rPr>
-                                  <w:sz w:val="24"/>
+                                  <w:sz w:val="20"/>
                                 </w:rPr>
                                 <w:t xml:space="preserve">           </w:t>
                               </w:r>
                               <w:r>
                                 <w:rPr>
-                                  <w:sz w:val="24"/>
+                                  <w:sz w:val="20"/>
                                 </w:rPr>
                                 <w:t xml:space="preserve"> </w:t>
                               </w:r>
                               <w:r>
                                 <w:rPr>
-                                  <w:sz w:val="24"/>
+                                  <w:sz w:val="20"/>
                                 </w:rPr>
                                 <w:t xml:space="preserve"> </w:t>
                               </w:r>
                               <w:r>
                                 <w:rPr>
-                                  <w:sz w:val="24"/>
+                                  <w:sz w:val="20"/>
                                 </w:rPr>
                                 <w:t xml:space="preserve"> CNPJ </w:t>
                               </w:r>
                               <w:r>
                                 <w:rPr>
-                                  <w:sz w:val="24"/>
+                                  <w:sz w:val="20"/>
                                 </w:rPr>
                                 <w:t xml:space="preserve">             </w:t>
                               </w:r>
@@ -590,7 +590,7 @@
                                 <w:rPr>
                                   <w:b/>
                                   <w:bCs/>
-                                  <w:sz w:val="24"/>
+                                  <w:sz w:val="20"/>
                                 </w:rPr>
                                 <w:t>41 560 212 0001 00</w:t>
                               </w:r>
@@ -599,7 +599,7 @@
                               <w:pPr>
                                 <w:spacing w:before="40"/>
                                 <w:rPr>
-                                  <w:sz w:val="24"/>
+                                  <w:sz w:val="20"/>
                                 </w:rPr>
                               </w:pPr>
                             </w:p>
@@ -607,7 +607,7 @@
                               <w:pPr>
                                 <w:rPr>
                                   <w:rFonts w:ascii="Calibri"/>
-                                  <w:sz w:val="28"/>
+                                  <w:sz w:val="20"/>
                                   <w:lang w:val="pt-BR"/>
                                 </w:rPr>
                               </w:pPr>
@@ -663,8 +663,8 @@
                                 <w:rPr>
                                   <w:rFonts w:ascii="Calibri"/>
                                   <w:spacing w:val="-5"/>
-                                  <w:sz w:val="24"/>
-                                  <w:szCs w:val="24"/>
+                                  <w:sz w:val="20"/>
+                                  <w:szCs w:val="20"/>
                                   <w:lang w:val="pt-BR"/>
                                 </w:rPr>
                                 <w:t xml:space="preserve"> </w:t>
@@ -673,8 +673,8 @@
                                 <w:rPr>
                                   <w:rFonts w:ascii="Calibri"/>
                                   <w:spacing w:val="-5"/>
-                                  <w:sz w:val="24"/>
-                                  <w:szCs w:val="24"/>
+                                  <w:sz w:val="20"/>
+                                  <w:szCs w:val="20"/>
                                   <w:lang w:val="pt-BR"/>
                                 </w:rPr>
                                 <w:t xml:space="preserve"> </w:t>
@@ -683,8 +683,8 @@
                                 <w:rPr>
                                   <w:rFonts w:ascii="Calibri"/>
                                   <w:spacing w:val="-5"/>
-                                  <w:sz w:val="24"/>
-                                  <w:szCs w:val="24"/>
+                                  <w:sz w:val="20"/>
+                                  <w:szCs w:val="20"/>
                                   <w:lang w:val="pt-BR"/>
                                 </w:rPr>
                                 <w:t xml:space="preserve"> </w:t>
@@ -693,8 +693,8 @@
                                 <w:rPr>
                                   <w:rFonts w:ascii="Calibri"/>
                                   <w:spacing w:val="-5"/>
-                                  <w:sz w:val="24"/>
-                                  <w:szCs w:val="24"/>
+                                  <w:sz w:val="20"/>
+                                  <w:szCs w:val="20"/>
                                   <w:lang w:val="pt-BR"/>
                                 </w:rPr>
                                 <w:t xml:space="preserve">{NOME}</w:t>
@@ -703,8 +703,8 @@
                                 <w:rPr>
                                   <w:rFonts w:ascii="Calibri"/>
                                   <w:spacing w:val="-5"/>
-                                  <w:sz w:val="24"/>
-                                  <w:szCs w:val="24"/>
+                                  <w:sz w:val="20"/>
+                                  <w:szCs w:val="20"/>
                                   <w:lang w:val="pt-BR"/>
                                 </w:rPr>
                                 <w:t xml:space="preserve"> </w:t>
@@ -713,8 +713,8 @@
                                 <w:rPr>
                                   <w:rFonts w:ascii="Calibri"/>
                                   <w:spacing w:val="-5"/>
-                                  <w:sz w:val="24"/>
-                                  <w:szCs w:val="24"/>
+                                  <w:sz w:val="20"/>
+                                  <w:szCs w:val="20"/>
                                   <w:lang w:val="pt-BR"/>
                                 </w:rPr>
                                 <w:t xml:space="preserve"> </w:t>
@@ -723,8 +723,8 @@
                                 <w:rPr>
                                   <w:rFonts w:ascii="Calibri"/>
                                   <w:spacing w:val="-5"/>
-                                  <w:sz w:val="24"/>
-                                  <w:szCs w:val="24"/>
+                                  <w:sz w:val="20"/>
+                                  <w:szCs w:val="20"/>
                                   <w:lang w:val="pt-BR"/>
                                 </w:rPr>
                                 <w:t xml:space="preserve">                                   </w:t>
@@ -906,7 +906,7 @@
                                 <w:spacing w:line="240" w:lineRule="exact"/>
                                 <w:rPr>
                                   <w:rFonts w:ascii="Calibri"/>
-                                  <w:sz w:val="24"/>
+                                  <w:sz w:val="20"/>
                                 </w:rPr>
                               </w:pPr>
                             </w:p>
@@ -1480,13 +1480,13 @@
                                 <w:spacing w:line="277" w:lineRule="exact"/>
                                 <w:rPr>
                                   <w:rFonts w:ascii="Calibri" w:hAnsi="Calibri"/>
-                                  <w:sz w:val="28"/>
+                                  <w:sz w:val="20"/>
                                 </w:rPr>
                               </w:pPr>
                               <w:r>
                                 <w:rPr>
                                   <w:rFonts w:ascii="Calibri" w:hAnsi="Calibri"/>
-                                  <w:sz w:val="28"/>
+                                  <w:sz w:val="20"/>
                                 </w:rPr>
                                 <w:t>Rua</w:t>
                               </w:r>
@@ -1494,14 +1494,14 @@
                                 <w:rPr>
                                   <w:rFonts w:ascii="Calibri" w:hAnsi="Calibri"/>
                                   <w:spacing w:val="-7"/>
-                                  <w:sz w:val="28"/>
+                                  <w:sz w:val="20"/>
                                 </w:rPr>
                                 <w:t xml:space="preserve"> </w:t>
                               </w:r>
                               <w:r>
                                 <w:rPr>
                                   <w:rFonts w:ascii="Calibri" w:hAnsi="Calibri"/>
-                                  <w:sz w:val="28"/>
+                                  <w:sz w:val="20"/>
                                 </w:rPr>
                                 <w:t>Tolentino Filgueiras,145</w:t>
                               </w:r>
@@ -1509,14 +1509,14 @@
                                 <w:rPr>
                                   <w:rFonts w:ascii="Calibri" w:hAnsi="Calibri"/>
                                   <w:spacing w:val="-1"/>
-                                  <w:sz w:val="28"/>
+                                  <w:sz w:val="20"/>
                                 </w:rPr>
                                 <w:t xml:space="preserve"> </w:t>
                               </w:r>
                               <w:r>
                                 <w:rPr>
                                   <w:rFonts w:ascii="Calibri" w:hAnsi="Calibri"/>
-                                  <w:sz w:val="28"/>
+                                  <w:sz w:val="20"/>
                                 </w:rPr>
                                 <w:t>-</w:t>
                               </w:r>
@@ -1524,14 +1524,14 @@
                                 <w:rPr>
                                   <w:rFonts w:ascii="Calibri" w:hAnsi="Calibri"/>
                                   <w:spacing w:val="-1"/>
-                                  <w:sz w:val="28"/>
+                                  <w:sz w:val="20"/>
                                 </w:rPr>
                                 <w:t xml:space="preserve"> </w:t>
                               </w:r>
                               <w:r>
                                 <w:rPr>
                                   <w:rFonts w:ascii="Calibri" w:hAnsi="Calibri"/>
-                                  <w:sz w:val="28"/>
+                                  <w:sz w:val="20"/>
                                 </w:rPr>
                                 <w:t>7°</w:t>
                               </w:r>
@@ -1539,14 +1539,14 @@
                                 <w:rPr>
                                   <w:rFonts w:ascii="Calibri" w:hAnsi="Calibri"/>
                                   <w:spacing w:val="3"/>
-                                  <w:sz w:val="28"/>
+                                  <w:sz w:val="20"/>
                                 </w:rPr>
                                 <w:t xml:space="preserve"> </w:t>
                               </w:r>
                               <w:r>
                                 <w:rPr>
                                   <w:rFonts w:ascii="Calibri" w:hAnsi="Calibri"/>
-                                  <w:sz w:val="28"/>
+                                  <w:sz w:val="20"/>
                                 </w:rPr>
                                 <w:t>andar</w:t>
                               </w:r>
@@ -1554,14 +1554,14 @@
                                 <w:rPr>
                                   <w:rFonts w:ascii="Calibri" w:hAnsi="Calibri"/>
                                   <w:spacing w:val="-3"/>
-                                  <w:sz w:val="28"/>
+                                  <w:sz w:val="20"/>
                                 </w:rPr>
                                 <w:t xml:space="preserve"> </w:t>
                               </w:r>
                               <w:r>
                                 <w:rPr>
                                   <w:rFonts w:ascii="Calibri" w:hAnsi="Calibri"/>
-                                  <w:sz w:val="28"/>
+                                  <w:sz w:val="20"/>
                                 </w:rPr>
                                 <w:t>-</w:t>
                               </w:r>
@@ -1569,14 +1569,14 @@
                                 <w:rPr>
                                   <w:rFonts w:ascii="Calibri" w:hAnsi="Calibri"/>
                                   <w:spacing w:val="2"/>
-                                  <w:sz w:val="28"/>
+                                  <w:sz w:val="20"/>
                                 </w:rPr>
                                 <w:t xml:space="preserve"> </w:t>
                               </w:r>
                               <w:r>
                                 <w:rPr>
                                   <w:rFonts w:ascii="Calibri" w:hAnsi="Calibri"/>
-                                  <w:sz w:val="28"/>
+                                  <w:sz w:val="20"/>
                                 </w:rPr>
                                 <w:t>Cj.</w:t>
                               </w:r>
@@ -1584,14 +1584,14 @@
                                 <w:rPr>
                                   <w:rFonts w:ascii="Calibri" w:hAnsi="Calibri"/>
                                   <w:spacing w:val="3"/>
-                                  <w:sz w:val="28"/>
+                                  <w:sz w:val="20"/>
                                 </w:rPr>
                                 <w:t xml:space="preserve"> </w:t>
                               </w:r>
                               <w:r>
                                 <w:rPr>
                                   <w:rFonts w:ascii="Calibri" w:hAnsi="Calibri"/>
-                                  <w:sz w:val="28"/>
+                                  <w:sz w:val="20"/>
                                 </w:rPr>
                                 <w:t>72</w:t>
                               </w:r>
@@ -1599,14 +1599,14 @@
                                 <w:rPr>
                                   <w:rFonts w:ascii="Calibri" w:hAnsi="Calibri"/>
                                   <w:spacing w:val="-1"/>
-                                  <w:sz w:val="28"/>
+                                  <w:sz w:val="20"/>
                                 </w:rPr>
                                 <w:t xml:space="preserve"> </w:t>
                               </w:r>
                               <w:r>
                                 <w:rPr>
                                   <w:rFonts w:ascii="Calibri" w:hAnsi="Calibri"/>
-                                  <w:sz w:val="28"/>
+                                  <w:sz w:val="20"/>
                                 </w:rPr>
                                 <w:t>-</w:t>
                               </w:r>
@@ -1614,14 +1614,14 @@
                                 <w:rPr>
                                   <w:rFonts w:ascii="Calibri" w:hAnsi="Calibri"/>
                                   <w:spacing w:val="2"/>
-                                  <w:sz w:val="28"/>
+                                  <w:sz w:val="20"/>
                                 </w:rPr>
                                 <w:t xml:space="preserve"> </w:t>
                               </w:r>
                               <w:r>
                                 <w:rPr>
                                   <w:rFonts w:ascii="Calibri" w:hAnsi="Calibri"/>
-                                  <w:sz w:val="28"/>
+                                  <w:sz w:val="20"/>
                                 </w:rPr>
                                 <w:t>Gonzaga</w:t>
                               </w:r>
@@ -1629,14 +1629,14 @@
                                 <w:rPr>
                                   <w:rFonts w:ascii="Calibri" w:hAnsi="Calibri"/>
                                   <w:spacing w:val="-1"/>
-                                  <w:sz w:val="28"/>
+                                  <w:sz w:val="20"/>
                                 </w:rPr>
                                 <w:t xml:space="preserve"> </w:t>
                               </w:r>
                               <w:r>
                                 <w:rPr>
                                   <w:rFonts w:ascii="Calibri" w:hAnsi="Calibri"/>
-                                  <w:sz w:val="28"/>
+                                  <w:sz w:val="20"/>
                                 </w:rPr>
                                 <w:t>-</w:t>
                               </w:r>
@@ -1644,14 +1644,14 @@
                                 <w:rPr>
                                   <w:rFonts w:ascii="Calibri" w:hAnsi="Calibri"/>
                                   <w:spacing w:val="-2"/>
-                                  <w:sz w:val="28"/>
+                                  <w:sz w:val="20"/>
                                 </w:rPr>
                                 <w:t xml:space="preserve"> </w:t>
                               </w:r>
                               <w:r>
                                 <w:rPr>
                                   <w:rFonts w:ascii="Calibri" w:hAnsi="Calibri"/>
-                                  <w:sz w:val="28"/>
+                                  <w:sz w:val="20"/>
                                 </w:rPr>
                                 <w:t>Santos</w:t>
                               </w:r>
@@ -1659,14 +1659,14 @@
                                 <w:rPr>
                                   <w:rFonts w:ascii="Calibri" w:hAnsi="Calibri"/>
                                   <w:spacing w:val="-1"/>
-                                  <w:sz w:val="28"/>
+                                  <w:sz w:val="20"/>
                                 </w:rPr>
                                 <w:t xml:space="preserve"> </w:t>
                               </w:r>
                               <w:r>
                                 <w:rPr>
                                   <w:rFonts w:ascii="Calibri" w:hAnsi="Calibri"/>
-                                  <w:sz w:val="28"/>
+                                  <w:sz w:val="20"/>
                                 </w:rPr>
                                 <w:t>-</w:t>
                               </w:r>
@@ -1674,14 +1674,14 @@
                                 <w:rPr>
                                   <w:rFonts w:ascii="Calibri" w:hAnsi="Calibri"/>
                                   <w:spacing w:val="2"/>
-                                  <w:sz w:val="28"/>
+                                  <w:sz w:val="20"/>
                                 </w:rPr>
                                 <w:t xml:space="preserve"> </w:t>
                               </w:r>
                               <w:r>
                                 <w:rPr>
                                   <w:rFonts w:ascii="Calibri" w:hAnsi="Calibri"/>
-                                  <w:sz w:val="28"/>
+                                  <w:sz w:val="20"/>
                                 </w:rPr>
                                 <w:t>SP</w:t>
                               </w:r>
@@ -1689,14 +1689,14 @@
                                 <w:rPr>
                                   <w:rFonts w:ascii="Calibri" w:hAnsi="Calibri"/>
                                   <w:spacing w:val="-2"/>
-                                  <w:sz w:val="28"/>
+                                  <w:sz w:val="20"/>
                                 </w:rPr>
                                 <w:t xml:space="preserve"> </w:t>
                               </w:r>
                               <w:r>
                                 <w:rPr>
                                   <w:rFonts w:ascii="Calibri" w:hAnsi="Calibri"/>
-                                  <w:sz w:val="28"/>
+                                  <w:sz w:val="20"/>
                                 </w:rPr>
                                 <w:t>-</w:t>
                               </w:r>
@@ -1704,7 +1704,7 @@
                                 <w:rPr>
                                   <w:rFonts w:ascii="Calibri" w:hAnsi="Calibri"/>
                                   <w:spacing w:val="2"/>
-                                  <w:sz w:val="28"/>
+                                  <w:sz w:val="20"/>
                                 </w:rPr>
                                 <w:t xml:space="preserve"> </w:t>
                               </w:r>
@@ -1712,7 +1712,7 @@
                                 <w:rPr>
                                   <w:rFonts w:ascii="Calibri" w:hAnsi="Calibri"/>
                                   <w:spacing w:val="-5"/>
-                                  <w:sz w:val="28"/>
+                                  <w:sz w:val="20"/>
                                 </w:rPr>
                                 <w:t>CEP</w:t>
                               </w:r>
@@ -1722,13 +1722,13 @@
                                 <w:spacing w:line="328" w:lineRule="exact"/>
                                 <w:rPr>
                                   <w:rFonts w:ascii="Calibri"/>
-                                  <w:sz w:val="28"/>
+                                  <w:sz w:val="20"/>
                                 </w:rPr>
                               </w:pPr>
                               <w:r>
                                 <w:rPr>
                                   <w:rFonts w:ascii="Calibri"/>
-                                  <w:sz w:val="28"/>
+                                  <w:sz w:val="20"/>
                                 </w:rPr>
                                 <w:t>11060-471</w:t>
                               </w:r>
@@ -1736,14 +1736,14 @@
                                 <w:rPr>
                                   <w:rFonts w:ascii="Calibri"/>
                                   <w:spacing w:val="-7"/>
-                                  <w:sz w:val="28"/>
+                                  <w:sz w:val="20"/>
                                 </w:rPr>
                                 <w:t xml:space="preserve"> </w:t>
                               </w:r>
                               <w:r>
                                 <w:rPr>
                                   <w:rFonts w:ascii="Calibri"/>
-                                  <w:sz w:val="28"/>
+                                  <w:sz w:val="20"/>
                                 </w:rPr>
                                 <w:t>-</w:t>
                               </w:r>
@@ -1751,14 +1751,14 @@
                                 <w:rPr>
                                   <w:rFonts w:ascii="Calibri"/>
                                   <w:spacing w:val="-3"/>
-                                  <w:sz w:val="28"/>
+                                  <w:sz w:val="20"/>
                                 </w:rPr>
                                 <w:t xml:space="preserve"> </w:t>
                               </w:r>
                               <w:r>
                                 <w:rPr>
                                   <w:rFonts w:ascii="Calibri"/>
-                                  <w:sz w:val="28"/>
+                                  <w:sz w:val="20"/>
                                 </w:rPr>
                                 <w:t>Tel:</w:t>
                               </w:r>
@@ -1766,14 +1766,14 @@
                                 <w:rPr>
                                   <w:rFonts w:ascii="Calibri"/>
                                   <w:spacing w:val="-5"/>
-                                  <w:sz w:val="28"/>
+                                  <w:sz w:val="20"/>
                                 </w:rPr>
                                 <w:t xml:space="preserve"> </w:t>
                               </w:r>
                               <w:r>
                                 <w:rPr>
                                   <w:rFonts w:ascii="Calibri"/>
-                                  <w:sz w:val="28"/>
+                                  <w:sz w:val="20"/>
                                 </w:rPr>
                                 <w:t>(13) 2102-</w:t>
                               </w:r>
@@ -1781,7 +1781,7 @@
                                 <w:rPr>
                                   <w:rFonts w:ascii="Calibri"/>
                                   <w:spacing w:val="-4"/>
-                                  <w:sz w:val="28"/>
+                                  <w:sz w:val="20"/>
                                 </w:rPr>
                                 <w:t>8888</w:t>
                               </w:r>
@@ -1939,7 +1939,7 @@
                           <w:spacing w:line="268" w:lineRule="exact"/>
                           <w:ind w:left="31"/>
                           <w:rPr>
-                            <w:sz w:val="24"/>
+                            <w:sz w:val="20"/>
                           </w:rPr>
                         </w:pPr>
                         <w:r>
@@ -1959,7 +1959,7 @@
                           <w:rPr>
                             <w:rFonts w:ascii="Arial" w:hAnsi="Arial"/>
                             <w:b/>
-                            <w:sz w:val="24"/>
+                            <w:sz w:val="20"/>
                             <w:u w:val="single"/>
                           </w:rPr>
                           <w:t xml:space="preserve"> </w:t>
@@ -1968,7 +1968,7 @@
                           <w:rPr>
                             <w:rFonts w:ascii="Arial" w:hAnsi="Arial"/>
                             <w:b/>
-                            <w:sz w:val="24"/>
+                            <w:sz w:val="20"/>
                           </w:rPr>
                           <w:t>CARGO SHIPS CLEA</w:t>
                         </w:r>
@@ -1976,7 +1976,7 @@
                           <w:rPr>
                             <w:rFonts w:ascii="Arial" w:hAnsi="Arial"/>
                             <w:b/>
-                            <w:sz w:val="24"/>
+                            <w:sz w:val="20"/>
                           </w:rPr>
                           <w:t>NING LTDA</w:t>
                         </w:r>
@@ -1984,7 +1984,7 @@
                           <w:rPr>
                             <w:rFonts w:ascii="Arial" w:hAnsi="Arial"/>
                             <w:b/>
-                            <w:sz w:val="24"/>
+                            <w:sz w:val="20"/>
                           </w:rPr>
                           <w:t xml:space="preserve">  </w:t>
                         </w:r>
@@ -1992,7 +1992,7 @@
                           <w:rPr>
                             <w:rFonts w:ascii="Arial" w:hAnsi="Arial"/>
                             <w:b/>
-                            <w:sz w:val="24"/>
+                            <w:sz w:val="20"/>
                           </w:rPr>
                           <w:t xml:space="preserve">     </w:t>
                         </w:r>
@@ -2000,7 +2000,7 @@
                           <w:rPr>
                             <w:rFonts w:ascii="Arial" w:hAnsi="Arial"/>
                             <w:b/>
-                            <w:sz w:val="24"/>
+                            <w:sz w:val="20"/>
                           </w:rPr>
                           <w:t xml:space="preserve">                        </w:t>
                         </w:r>
@@ -2008,47 +2008,47 @@
                           <w:rPr>
                             <w:rFonts w:ascii="Arial" w:hAnsi="Arial"/>
                             <w:b/>
-                            <w:sz w:val="24"/>
+                            <w:sz w:val="20"/>
                           </w:rPr>
                           <w:t xml:space="preserve">   </w:t>
                         </w:r>
                         <w:r>
                           <w:rPr>
-                            <w:sz w:val="24"/>
+                            <w:sz w:val="20"/>
                           </w:rPr>
                           <w:t>UNIDADE</w:t>
                         </w:r>
                         <w:r>
                           <w:rPr>
                             <w:spacing w:val="-8"/>
-                            <w:sz w:val="24"/>
+                            <w:sz w:val="20"/>
                           </w:rPr>
                           <w:t xml:space="preserve"> </w:t>
                         </w:r>
                         <w:r>
                           <w:rPr>
-                            <w:sz w:val="24"/>
+                            <w:sz w:val="20"/>
                           </w:rPr>
                           <w:t>/</w:t>
                         </w:r>
                         <w:r>
                           <w:rPr>
                             <w:spacing w:val="-1"/>
-                            <w:sz w:val="24"/>
+                            <w:sz w:val="20"/>
                           </w:rPr>
                           <w:t xml:space="preserve"> </w:t>
                         </w:r>
                         <w:r>
                           <w:rPr>
                             <w:spacing w:val="-2"/>
-                            <w:sz w:val="24"/>
+                            <w:sz w:val="20"/>
                           </w:rPr>
                           <w:t>ÁREA:</w:t>
                         </w:r>
                         <w:r>
                           <w:rPr>
                             <w:spacing w:val="-2"/>
-                            <w:sz w:val="24"/>
+                            <w:sz w:val="20"/>
                             <w:u w:val="single"/>
                           </w:rPr>
                           <w:t>SANTOS</w:t>
@@ -2056,7 +2056,7 @@
                         <w:r>
                           <w:rPr>
                             <w:spacing w:val="80"/>
-                            <w:sz w:val="24"/>
+                            <w:sz w:val="20"/>
                             <w:u w:val="single"/>
                           </w:rPr>
                           <w:t xml:space="preserve"> </w:t>
@@ -2066,36 +2066,36 @@
                         <w:pPr>
                           <w:spacing w:before="40"/>
                           <w:rPr>
-                            <w:sz w:val="24"/>
+                            <w:sz w:val="20"/>
                           </w:rPr>
                         </w:pPr>
                         <w:r>
                           <w:rPr>
-                            <w:sz w:val="24"/>
+                            <w:sz w:val="20"/>
                           </w:rPr>
                           <w:t xml:space="preserve">           </w:t>
                         </w:r>
                         <w:r>
                           <w:rPr>
-                            <w:sz w:val="24"/>
+                            <w:sz w:val="20"/>
                           </w:rPr>
                           <w:t xml:space="preserve"> </w:t>
                         </w:r>
                         <w:r>
                           <w:rPr>
-                            <w:sz w:val="24"/>
+                            <w:sz w:val="20"/>
                           </w:rPr>
                           <w:t xml:space="preserve"> </w:t>
                         </w:r>
                         <w:r>
                           <w:rPr>
-                            <w:sz w:val="24"/>
+                            <w:sz w:val="20"/>
                           </w:rPr>
                           <w:t xml:space="preserve"> CNPJ </w:t>
                         </w:r>
                         <w:r>
                           <w:rPr>
-                            <w:sz w:val="24"/>
+                            <w:sz w:val="20"/>
                           </w:rPr>
                           <w:t xml:space="preserve">             </w:t>
                         </w:r>
@@ -2103,7 +2103,7 @@
                           <w:rPr>
                             <w:b/>
                             <w:bCs/>
-                            <w:sz w:val="24"/>
+                            <w:sz w:val="20"/>
                           </w:rPr>
                           <w:t>41 560 212 0001 00</w:t>
                         </w:r>
@@ -2112,7 +2112,7 @@
                         <w:pPr>
                           <w:spacing w:before="40"/>
                           <w:rPr>
-                            <w:sz w:val="24"/>
+                            <w:sz w:val="20"/>
                           </w:rPr>
                         </w:pPr>
                       </w:p>
@@ -2120,7 +2120,7 @@
                         <w:pPr>
                           <w:rPr>
                             <w:rFonts w:ascii="Calibri"/>
-                            <w:sz w:val="28"/>
+                            <w:sz w:val="20"/>
                             <w:lang w:val="pt-BR"/>
                           </w:rPr>
                         </w:pPr>
@@ -2176,8 +2176,8 @@
                           <w:rPr>
                             <w:rFonts w:ascii="Calibri"/>
                             <w:spacing w:val="-5"/>
-                            <w:sz w:val="24"/>
-                            <w:szCs w:val="24"/>
+                            <w:sz w:val="20"/>
+                            <w:szCs w:val="20"/>
                             <w:lang w:val="pt-BR"/>
                           </w:rPr>
                           <w:t xml:space="preserve"> </w:t>
@@ -2186,8 +2186,8 @@
                           <w:rPr>
                             <w:rFonts w:ascii="Calibri"/>
                             <w:spacing w:val="-5"/>
-                            <w:sz w:val="24"/>
-                            <w:szCs w:val="24"/>
+                            <w:sz w:val="20"/>
+                            <w:szCs w:val="20"/>
                             <w:lang w:val="pt-BR"/>
                           </w:rPr>
                           <w:t xml:space="preserve"> </w:t>
@@ -2196,8 +2196,8 @@
                           <w:rPr>
                             <w:rFonts w:ascii="Calibri"/>
                             <w:spacing w:val="-5"/>
-                            <w:sz w:val="24"/>
-                            <w:szCs w:val="24"/>
+                            <w:sz w:val="20"/>
+                            <w:szCs w:val="20"/>
                             <w:lang w:val="pt-BR"/>
                           </w:rPr>
                           <w:t xml:space="preserve"> </w:t>
@@ -2206,8 +2206,8 @@
                           <w:rPr>
                             <w:rFonts w:ascii="Calibri"/>
                             <w:spacing w:val="-5"/>
-                            <w:sz w:val="24"/>
-                            <w:szCs w:val="24"/>
+                            <w:sz w:val="20"/>
+                            <w:szCs w:val="20"/>
                             <w:lang w:val="pt-BR"/>
                           </w:rPr>
                           <w:t xml:space="preserve">{NOME}</w:t>
@@ -2216,8 +2216,8 @@
                           <w:rPr>
                             <w:rFonts w:ascii="Calibri"/>
                             <w:spacing w:val="-5"/>
-                            <w:sz w:val="24"/>
-                            <w:szCs w:val="24"/>
+                            <w:sz w:val="20"/>
+                            <w:szCs w:val="20"/>
                             <w:lang w:val="pt-BR"/>
                           </w:rPr>
                           <w:t xml:space="preserve"> </w:t>
@@ -2226,8 +2226,8 @@
                           <w:rPr>
                             <w:rFonts w:ascii="Calibri"/>
                             <w:spacing w:val="-5"/>
-                            <w:sz w:val="24"/>
-                            <w:szCs w:val="24"/>
+                            <w:sz w:val="20"/>
+                            <w:szCs w:val="20"/>
                             <w:lang w:val="pt-BR"/>
                           </w:rPr>
                           <w:t xml:space="preserve"> </w:t>
@@ -2236,8 +2236,8 @@
                           <w:rPr>
                             <w:rFonts w:ascii="Calibri"/>
                             <w:spacing w:val="-5"/>
-                            <w:sz w:val="24"/>
-                            <w:szCs w:val="24"/>
+                            <w:sz w:val="20"/>
+                            <w:szCs w:val="20"/>
                             <w:lang w:val="pt-BR"/>
                           </w:rPr>
                           <w:t xml:space="preserve">                                   </w:t>
@@ -2341,7 +2341,7 @@
                           <w:spacing w:line="240" w:lineRule="exact"/>
                           <w:rPr>
                             <w:rFonts w:ascii="Calibri"/>
-                            <w:sz w:val="24"/>
+                            <w:sz w:val="20"/>
                           </w:rPr>
                         </w:pPr>
                       </w:p>
@@ -2720,13 +2720,13 @@
                           <w:spacing w:line="277" w:lineRule="exact"/>
                           <w:rPr>
                             <w:rFonts w:ascii="Calibri" w:hAnsi="Calibri"/>
-                            <w:sz w:val="28"/>
+                            <w:sz w:val="20"/>
                           </w:rPr>
                         </w:pPr>
                         <w:r>
                           <w:rPr>
                             <w:rFonts w:ascii="Calibri" w:hAnsi="Calibri"/>
-                            <w:sz w:val="28"/>
+                            <w:sz w:val="20"/>
                           </w:rPr>
                           <w:t>Rua</w:t>
                         </w:r>
@@ -2734,14 +2734,14 @@
                           <w:rPr>
                             <w:rFonts w:ascii="Calibri" w:hAnsi="Calibri"/>
                             <w:spacing w:val="-7"/>
-                            <w:sz w:val="28"/>
+                            <w:sz w:val="20"/>
                           </w:rPr>
                           <w:t xml:space="preserve"> </w:t>
                         </w:r>
                         <w:r>
                           <w:rPr>
                             <w:rFonts w:ascii="Calibri" w:hAnsi="Calibri"/>
-                            <w:sz w:val="28"/>
+                            <w:sz w:val="20"/>
                           </w:rPr>
                           <w:t>Tolentino Filgueiras,145</w:t>
                         </w:r>
@@ -2749,14 +2749,14 @@
                           <w:rPr>
                             <w:rFonts w:ascii="Calibri" w:hAnsi="Calibri"/>
                             <w:spacing w:val="-1"/>
-                            <w:sz w:val="28"/>
+                            <w:sz w:val="20"/>
                           </w:rPr>
                           <w:t xml:space="preserve"> </w:t>
                         </w:r>
                         <w:r>
                           <w:rPr>
                             <w:rFonts w:ascii="Calibri" w:hAnsi="Calibri"/>
-                            <w:sz w:val="28"/>
+                            <w:sz w:val="20"/>
                           </w:rPr>
                           <w:t>-</w:t>
                         </w:r>
@@ -2764,14 +2764,14 @@
                           <w:rPr>
                             <w:rFonts w:ascii="Calibri" w:hAnsi="Calibri"/>
                             <w:spacing w:val="-1"/>
-                            <w:sz w:val="28"/>
+                            <w:sz w:val="20"/>
                           </w:rPr>
                           <w:t xml:space="preserve"> </w:t>
                         </w:r>
                         <w:r>
                           <w:rPr>
                             <w:rFonts w:ascii="Calibri" w:hAnsi="Calibri"/>
-                            <w:sz w:val="28"/>
+                            <w:sz w:val="20"/>
                           </w:rPr>
                           <w:t>7°</w:t>
                         </w:r>
@@ -2779,14 +2779,14 @@
                           <w:rPr>
                             <w:rFonts w:ascii="Calibri" w:hAnsi="Calibri"/>
                             <w:spacing w:val="3"/>
-                            <w:sz w:val="28"/>
+                            <w:sz w:val="20"/>
                           </w:rPr>
                           <w:t xml:space="preserve"> </w:t>
                         </w:r>
                         <w:r>
                           <w:rPr>
                             <w:rFonts w:ascii="Calibri" w:hAnsi="Calibri"/>
-                            <w:sz w:val="28"/>
+                            <w:sz w:val="20"/>
                           </w:rPr>
                           <w:t>andar</w:t>
                         </w:r>
@@ -2794,14 +2794,14 @@
                           <w:rPr>
                             <w:rFonts w:ascii="Calibri" w:hAnsi="Calibri"/>
                             <w:spacing w:val="-3"/>
-                            <w:sz w:val="28"/>
+                            <w:sz w:val="20"/>
                           </w:rPr>
                           <w:t xml:space="preserve"> </w:t>
                         </w:r>
                         <w:r>
                           <w:rPr>
                             <w:rFonts w:ascii="Calibri" w:hAnsi="Calibri"/>
-                            <w:sz w:val="28"/>
+                            <w:sz w:val="20"/>
                           </w:rPr>
                           <w:t>-</w:t>
                         </w:r>
@@ -2809,14 +2809,14 @@
                           <w:rPr>
                             <w:rFonts w:ascii="Calibri" w:hAnsi="Calibri"/>
                             <w:spacing w:val="2"/>
-                            <w:sz w:val="28"/>
+                            <w:sz w:val="20"/>
                           </w:rPr>
                           <w:t xml:space="preserve"> </w:t>
                         </w:r>
                         <w:r>
                           <w:rPr>
                             <w:rFonts w:ascii="Calibri" w:hAnsi="Calibri"/>
-                            <w:sz w:val="28"/>
+                            <w:sz w:val="20"/>
                           </w:rPr>
                           <w:t>Cj.</w:t>
                         </w:r>
@@ -2824,14 +2824,14 @@
                           <w:rPr>
                             <w:rFonts w:ascii="Calibri" w:hAnsi="Calibri"/>
                             <w:spacing w:val="3"/>
-                            <w:sz w:val="28"/>
+                            <w:sz w:val="20"/>
                           </w:rPr>
                           <w:t xml:space="preserve"> </w:t>
                         </w:r>
                         <w:r>
                           <w:rPr>
                             <w:rFonts w:ascii="Calibri" w:hAnsi="Calibri"/>
-                            <w:sz w:val="28"/>
+                            <w:sz w:val="20"/>
                           </w:rPr>
                           <w:t>72</w:t>
                         </w:r>
@@ -2839,14 +2839,14 @@
                           <w:rPr>
                             <w:rFonts w:ascii="Calibri" w:hAnsi="Calibri"/>
                             <w:spacing w:val="-1"/>
-                            <w:sz w:val="28"/>
+                            <w:sz w:val="20"/>
                           </w:rPr>
                           <w:t xml:space="preserve"> </w:t>
                         </w:r>
                         <w:r>
                           <w:rPr>
                             <w:rFonts w:ascii="Calibri" w:hAnsi="Calibri"/>
-                            <w:sz w:val="28"/>
+                            <w:sz w:val="20"/>
                           </w:rPr>
                           <w:t>-</w:t>
                         </w:r>
@@ -2854,14 +2854,14 @@
                           <w:rPr>
                             <w:rFonts w:ascii="Calibri" w:hAnsi="Calibri"/>
                             <w:spacing w:val="2"/>
-                            <w:sz w:val="28"/>
+                            <w:sz w:val="20"/>
                           </w:rPr>
                           <w:t xml:space="preserve"> </w:t>
                         </w:r>
                         <w:r>
                           <w:rPr>
                             <w:rFonts w:ascii="Calibri" w:hAnsi="Calibri"/>
-                            <w:sz w:val="28"/>
+                            <w:sz w:val="20"/>
                           </w:rPr>
                           <w:t>Gonzaga</w:t>
                         </w:r>
@@ -2869,14 +2869,14 @@
                           <w:rPr>
                             <w:rFonts w:ascii="Calibri" w:hAnsi="Calibri"/>
                             <w:spacing w:val="-1"/>
-                            <w:sz w:val="28"/>
+                            <w:sz w:val="20"/>
                           </w:rPr>
                           <w:t xml:space="preserve"> </w:t>
                         </w:r>
                         <w:r>
                           <w:rPr>
                             <w:rFonts w:ascii="Calibri" w:hAnsi="Calibri"/>
-                            <w:sz w:val="28"/>
+                            <w:sz w:val="20"/>
                           </w:rPr>
                           <w:t>-</w:t>
                         </w:r>
@@ -2884,14 +2884,14 @@
                           <w:rPr>
                             <w:rFonts w:ascii="Calibri" w:hAnsi="Calibri"/>
                             <w:spacing w:val="-2"/>
-                            <w:sz w:val="28"/>
+                            <w:sz w:val="20"/>
                           </w:rPr>
                           <w:t xml:space="preserve"> </w:t>
                         </w:r>
                         <w:r>
                           <w:rPr>
                             <w:rFonts w:ascii="Calibri" w:hAnsi="Calibri"/>
-                            <w:sz w:val="28"/>
+                            <w:sz w:val="20"/>
                           </w:rPr>
                           <w:t>Santos</w:t>
                         </w:r>
@@ -2899,14 +2899,14 @@
                           <w:rPr>
                             <w:rFonts w:ascii="Calibri" w:hAnsi="Calibri"/>
                             <w:spacing w:val="-1"/>
-                            <w:sz w:val="28"/>
+                            <w:sz w:val="20"/>
                           </w:rPr>
                           <w:t xml:space="preserve"> </w:t>
                         </w:r>
                         <w:r>
                           <w:rPr>
                             <w:rFonts w:ascii="Calibri" w:hAnsi="Calibri"/>
-                            <w:sz w:val="28"/>
+                            <w:sz w:val="20"/>
                           </w:rPr>
                           <w:t>-</w:t>
                         </w:r>
@@ -2914,14 +2914,14 @@
                           <w:rPr>
                             <w:rFonts w:ascii="Calibri" w:hAnsi="Calibri"/>
                             <w:spacing w:val="2"/>
-                            <w:sz w:val="28"/>
+                            <w:sz w:val="20"/>
                           </w:rPr>
                           <w:t xml:space="preserve"> </w:t>
                         </w:r>
                         <w:r>
                           <w:rPr>
                             <w:rFonts w:ascii="Calibri" w:hAnsi="Calibri"/>
-                            <w:sz w:val="28"/>
+                            <w:sz w:val="20"/>
                           </w:rPr>
                           <w:t>SP</w:t>
                         </w:r>
@@ -2929,14 +2929,14 @@
                           <w:rPr>
                             <w:rFonts w:ascii="Calibri" w:hAnsi="Calibri"/>
                             <w:spacing w:val="-2"/>
-                            <w:sz w:val="28"/>
+                            <w:sz w:val="20"/>
                           </w:rPr>
                           <w:t xml:space="preserve"> </w:t>
                         </w:r>
                         <w:r>
                           <w:rPr>
                             <w:rFonts w:ascii="Calibri" w:hAnsi="Calibri"/>
-                            <w:sz w:val="28"/>
+                            <w:sz w:val="20"/>
                           </w:rPr>
                           <w:t>-</w:t>
                         </w:r>
@@ -2944,7 +2944,7 @@
                           <w:rPr>
                             <w:rFonts w:ascii="Calibri" w:hAnsi="Calibri"/>
                             <w:spacing w:val="2"/>
-                            <w:sz w:val="28"/>
+                            <w:sz w:val="20"/>
                           </w:rPr>
                           <w:t xml:space="preserve"> </w:t>
                         </w:r>
@@ -2952,7 +2952,7 @@
                           <w:rPr>
                             <w:rFonts w:ascii="Calibri" w:hAnsi="Calibri"/>
                             <w:spacing w:val="-5"/>
-                            <w:sz w:val="28"/>
+                            <w:sz w:val="20"/>
                           </w:rPr>
                           <w:t>CEP</w:t>
                         </w:r>
@@ -2962,13 +2962,13 @@
                           <w:spacing w:line="328" w:lineRule="exact"/>
                           <w:rPr>
                             <w:rFonts w:ascii="Calibri"/>
-                            <w:sz w:val="28"/>
+                            <w:sz w:val="20"/>
                           </w:rPr>
                         </w:pPr>
                         <w:r>
                           <w:rPr>
                             <w:rFonts w:ascii="Calibri"/>
-                            <w:sz w:val="28"/>
+                            <w:sz w:val="20"/>
                           </w:rPr>
                           <w:t>11060-471</w:t>
                         </w:r>
@@ -2976,14 +2976,14 @@
                           <w:rPr>
                             <w:rFonts w:ascii="Calibri"/>
                             <w:spacing w:val="-7"/>
-                            <w:sz w:val="28"/>
+                            <w:sz w:val="20"/>
                           </w:rPr>
                           <w:t xml:space="preserve"> </w:t>
                         </w:r>
                         <w:r>
                           <w:rPr>
                             <w:rFonts w:ascii="Calibri"/>
-                            <w:sz w:val="28"/>
+                            <w:sz w:val="20"/>
                           </w:rPr>
                           <w:t>-</w:t>
                         </w:r>
@@ -2991,14 +2991,14 @@
                           <w:rPr>
                             <w:rFonts w:ascii="Calibri"/>
                             <w:spacing w:val="-3"/>
-                            <w:sz w:val="28"/>
+                            <w:sz w:val="20"/>
                           </w:rPr>
                           <w:t xml:space="preserve"> </w:t>
                         </w:r>
                         <w:r>
                           <w:rPr>
                             <w:rFonts w:ascii="Calibri"/>
-                            <w:sz w:val="28"/>
+                            <w:sz w:val="20"/>
                           </w:rPr>
                           <w:t>Tel:</w:t>
                         </w:r>
@@ -3006,14 +3006,14 @@
                           <w:rPr>
                             <w:rFonts w:ascii="Calibri"/>
                             <w:spacing w:val="-5"/>
-                            <w:sz w:val="28"/>
+                            <w:sz w:val="20"/>
                           </w:rPr>
                           <w:t xml:space="preserve"> </w:t>
                         </w:r>
                         <w:r>
                           <w:rPr>
                             <w:rFonts w:ascii="Calibri"/>
-                            <w:sz w:val="28"/>
+                            <w:sz w:val="20"/>
                           </w:rPr>
                           <w:t>(13) 2102-</w:t>
                         </w:r>
@@ -3021,7 +3021,7 @@
                           <w:rPr>
                             <w:rFonts w:ascii="Calibri"/>
                             <w:spacing w:val="-4"/>
-                            <w:sz w:val="28"/>
+                            <w:sz w:val="20"/>
                           </w:rPr>
                           <w:t>8888</w:t>
                         </w:r>

</xml_diff>